<commit_message>
Rewrite report prose in a more natural, first-person voice
Co-Authored-By: Claude Sonnet 5 <noreply@anthropic.com>
</commit_message>
<xml_diff>
--- a/REPORT.docx
+++ b/REPORT.docx
@@ -20,7 +20,7 @@
     </w:p>
     <w:p>
       <w:r>
-        <w:t>Compute pairwise similarity scores between a set of documents using a Vector Space Model (VSM) with TF-IDF term weighting and cosine similarity.</w:t>
+        <w:t>For this assignment I wanted to see how well a classic information retrieval technique -- the Vector Space Model (VSM) -- could pick up on topical relationships between documents just from their word usage, no machine learning training involved. The approach here is TF-IDF weighting combined with cosine similarity, computed between every pair of documents in a small collection.</w:t>
       </w:r>
     </w:p>
     <w:p>
@@ -33,7 +33,7 @@
     </w:p>
     <w:p>
       <w:r>
-        <w:t>8 documents were gathered from Wikipedia (public, freely accessible content, CC BY-SA) and saved as plain .txt files in docs/. Topics were chosen in four related pairs so the similarity results are easy to sanity check: two AI/ML topics, one AI-adjacent topic, two space topics, two sports topics, and one climate topic.</w:t>
+        <w:t>I needed 5-10 real, publicly available documents, so I pulled 8 articles from Wikipedia (public content, CC BY-SA licensed) and saved each one as a plain .txt file in docs/. Rather than picking random topics, I deliberately grouped them into related pairs -- two AI/ML articles, one that's AI-adjacent, two about space, two about team sports, and one on climate. The idea was that if the model works, related topics should score noticeably higher than unrelated ones, which makes the results easy to eyeball and sanity-check.</w:t>
       </w:r>
     </w:p>
     <w:tbl>
@@ -339,6 +339,11 @@
     <w:p/>
     <w:p>
       <w:r>
+        <w:t>To keep the text clean (no HTML, no nav bars, no infobox clutter) I pulled each article through Wikipedia's REST API using action=query&amp;prop=extracts&amp;explaintext=1 instead of scraping the rendered page. Each file ended up around 1.2 KB, with a short Title: / Source: header on top so the origin is traceable.</w:t>
+      </w:r>
+    </w:p>
+    <w:p>
+      <w:r>
         <w:t>Snapshot — document collection loaded:</w:t>
       </w:r>
     </w:p>
@@ -388,7 +393,7 @@
     </w:p>
     <w:p>
       <w:r>
-        <w:t>Implemented from scratch in vsm.py (numpy used only for vector arithmetic, not for the algorithm itself):</w:t>
+        <w:t>I built the whole pipeline from scratch in vsm.py -- no scikit-learn, no pre-built TF-IDF vectorizer. numpy only shows up for the actual vector math (dot products, norms), not for any part of the algorithm itself. Here's roughly how it works, in the order the code runs it:</w:t>
       </w:r>
     </w:p>
     <w:p>
@@ -396,7 +401,7 @@
         <w:pStyle w:val="ListNumber"/>
       </w:pPr>
       <w:r>
-        <w:t>Tokenize &amp; normalize — lowercase, strip to alphabetic tokens with a regex ([a-z]+), drop a small stopword list, drop tokens ≤ 2 chars.</w:t>
+        <w:t>Tokenize &amp; normalize. Lowercase everything, pull out alphabetic tokens with a simple regex ([a-z]+), strip a small stopword list, and drop anything 2 characters or shorter. Nothing fancy -- no stemming or lemmatization, just enough cleanup to stop noise words from swamping the vectors.</w:t>
       </w:r>
     </w:p>
     <w:p>
@@ -404,7 +409,7 @@
         <w:pStyle w:val="ListNumber"/>
       </w:pPr>
       <w:r>
-        <w:t>Build vocabulary — union of all terms across all documents (601 unique terms across the 8-document collection).</w:t>
+        <w:t>Build the vocabulary. Union of every term across all 8 documents. For this collection that came out to 601 unique terms.</w:t>
       </w:r>
     </w:p>
     <w:p>
@@ -412,7 +417,7 @@
         <w:pStyle w:val="ListNumber"/>
       </w:pPr>
       <w:r>
-        <w:t>Term Frequency (TF) — tf(t, d) = count(t in d) / len(d), raw count normalized by document length.</w:t>
+        <w:t>Term Frequency (TF). tf(t, d) = count(t in d) / len(d) -- how often a term shows up in a document, normalized by document length so longer documents don't automatically get bigger scores.</w:t>
       </w:r>
     </w:p>
     <w:p>
@@ -420,7 +425,7 @@
         <w:pStyle w:val="ListNumber"/>
       </w:pPr>
       <w:r>
-        <w:t>Inverse Document Frequency (IDF) — idf(t) = log(N / df(t)), where N is the number of documents and df(t) is the number of documents containing term t. Down-weights terms common across documents, up-weights distinctive terms.</w:t>
+        <w:t>Inverse Document Frequency (IDF). idf(t) = log(N / df(t)), where N is the total number of documents and df(t) is how many of them contain term t. This is really the important part -- it pushes down words that show up everywhere (things like "system" or "data") and gives more weight to words distinctive to just a few documents (like "neural", "mars", or "goalkeeper").</w:t>
       </w:r>
     </w:p>
     <w:p>
@@ -428,7 +433,7 @@
         <w:pStyle w:val="ListNumber"/>
       </w:pPr>
       <w:r>
-        <w:t>TF-IDF vector — tfidf(t, d) = tf(t, d) * idf(t), one scalar per vocabulary term, giving each document an N-dimensional vector.</w:t>
+        <w:t>TF-IDF vector. Multiply the two together -- tfidf(t, d) = tf(t, d) * idf(t) -- and each document ends up represented as a point in a 601-dimensional space, one axis per vocabulary term.</w:t>
       </w:r>
     </w:p>
     <w:p>
@@ -436,7 +441,7 @@
         <w:pStyle w:val="ListNumber"/>
       </w:pPr>
       <w:r>
-        <w:t>Cosine similarity — similarity(A, B) = (A · B) / (‖A‖ * ‖B‖). Scale-invariant, bounded in [0, 1] since TF-IDF weights are non-negative.</w:t>
+        <w:t>Cosine similarity. similarity(A, B) = (A · B) / (‖A‖ * ‖B‖). This is just the cosine of the angle between the vectors. It doesn't care how long the documents are (already handled by the TF normalization above), and since none of the TF-IDF weights are negative, the score always lands somewhere in [0, 1].</w:t>
       </w:r>
     </w:p>
     <w:p>
@@ -483,7 +488,7 @@
     </w:p>
     <w:p>
       <w:r>
-        <w:t>Full implementation: vsm.py (see GitHub repository).</w:t>
+        <w:t>Full implementation is in vsm.py (see GitHub repository) if you want to see the rest -- document loading, the driving loop that builds the pairwise matrix, etc.</w:t>
       </w:r>
     </w:p>
     <w:p>
@@ -537,7 +542,7 @@
     </w:p>
     <w:p>
       <w:r>
-        <w:t>Full similarity matrix:</w:t>
+        <w:t>Full matrix, for reference:</w:t>
       </w:r>
     </w:p>
     <w:tbl>
@@ -1387,7 +1392,7 @@
     <w:p/>
     <w:p>
       <w:r>
-        <w:t>Snapshot — heatmap:</w:t>
+        <w:t>I also plotted it as a heatmap, which honestly makes the pattern a lot easier to spot than staring at the numbers:</w:t>
       </w:r>
     </w:p>
     <w:p>
@@ -1429,7 +1434,7 @@
     <w:p/>
     <w:p>
       <w:r>
-        <w:t>Snapshot — top/bottom similar pairs:</w:t>
+        <w:t>And the top/bottom pairs, pulled straight from the script's own output:</w:t>
       </w:r>
     </w:p>
     <w:p>
@@ -1691,11 +1696,8 @@
       </w:r>
     </w:p>
     <w:p>
-      <w:pPr>
-        <w:pStyle w:val="ListBullet"/>
-      </w:pPr>
       <w:r>
-        <w:t>AI ↔ Machine Learning (0.207) is the highest score — expected, since ML is a subfield of AI and the two articles share heavy vocabulary overlap (learning, model, neural, data).</w:t>
+        <w:t>What I like about these results is that they line up with what you'd expect just from reading the topics, which is a decent sign the model is actually capturing something real and not just noise:</w:t>
       </w:r>
     </w:p>
     <w:p>
@@ -1703,7 +1705,7 @@
         <w:pStyle w:val="ListBullet"/>
       </w:pPr>
       <w:r>
-        <w:t>Football ↔ Basketball (0.127) is the second-highest — both are team sports articles sharing terms like team, player, game, league.</w:t>
+        <w:t>AI ↔ Machine Learning came out on top at 0.207, which makes sense -- ML is basically a subfield of AI, so the two articles share a lot of vocabulary (learning, model, neural, data all show up in both).</w:t>
       </w:r>
     </w:p>
     <w:p>
@@ -1711,7 +1713,7 @@
         <w:pStyle w:val="ListBullet"/>
       </w:pPr>
       <w:r>
-        <w:t>Cross-cluster pairs (e.g. sports vs. climate, space vs. sports) all score near 0, correctly showing the model finds no meaningful topical overlap between unrelated documents.</w:t>
+        <w:t>Football ↔ Basketball was second at 0.127. Both are team-sport articles, so words like team, player, game, and league overlap heavily.</w:t>
       </w:r>
     </w:p>
     <w:p>
@@ -1719,12 +1721,20 @@
         <w:pStyle w:val="ListBullet"/>
       </w:pPr>
       <w:r>
-        <w:t>Large Language Model correlates with AI (0.067) more than with ML (0.059), consistent with LLMs being described in AI-article terms as well as ML terms.</w:t>
+        <w:t>Every pair that crosses topic clusters -- sports vs. climate, space vs. sports, whatever -- scores close to zero. That's the model correctly telling us there's no real topical connection there.</w:t>
+      </w:r>
+    </w:p>
+    <w:p>
+      <w:pPr>
+        <w:pStyle w:val="ListBullet"/>
+      </w:pPr>
+      <w:r>
+        <w:t>One thing I found interesting: Large Language Model correlates more with AI (0.067) than with Machine Learning (0.059), even though you'd think ML and LLMs would be closer. My guess is the AI article uses more of the same framing language ("intelligence", "reasoning", "perception") that also shows up when LLMs get described.</w:t>
       </w:r>
     </w:p>
     <w:p>
       <w:r>
-        <w:t>TF-IDF weighting is what makes this work: without IDF down-weighting, common English scaffolding words would dominate every vector and flatten all similarity scores toward 1.0. IDF suppresses ubiquitous terms and lets the distinctive vocabulary of each topic drive the cosine score.</w:t>
+        <w:t>The IDF term is really doing most of the heavy lifting here. Without it, common scaffolding words that appear in basically every article would dominate the vectors and every pair would score close to 1.0, regardless of topic. IDF suppresses those and lets the words that are actually distinctive to each topic drive the cosine score.</w:t>
       </w:r>
     </w:p>
     <w:p>

</xml_diff>

<commit_message>
Remove first-person pronouns from report, keep neutral academic tone
Co-Authored-By: Claude Sonnet 5 <noreply@anthropic.com>
</commit_message>
<xml_diff>
--- a/REPORT.docx
+++ b/REPORT.docx
@@ -20,7 +20,7 @@
     </w:p>
     <w:p>
       <w:r>
-        <w:t>For this assignment I wanted to see how well a classic information retrieval technique -- the Vector Space Model (VSM) -- could pick up on topical relationships between documents just from their word usage, no machine learning training involved. The approach here is TF-IDF weighting combined with cosine similarity, computed between every pair of documents in a small collection.</w:t>
+        <w:t>This assignment looks at how well a classic information retrieval technique -- the Vector Space Model (VSM) -- picks up on topical relationships between documents based purely on word usage, with no machine learning training involved. The approach combines TF-IDF term weighting with cosine similarity, computed between every pair of documents in a small collection.</w:t>
       </w:r>
     </w:p>
     <w:p>
@@ -33,7 +33,7 @@
     </w:p>
     <w:p>
       <w:r>
-        <w:t>I needed 5-10 real, publicly available documents, so I pulled 8 articles from Wikipedia (public content, CC BY-SA licensed) and saved each one as a plain .txt file in docs/. Rather than picking random topics, I deliberately grouped them into related pairs -- two AI/ML articles, one that's AI-adjacent, two about space, two about team sports, and one on climate. The idea was that if the model works, related topics should score noticeably higher than unrelated ones, which makes the results easy to eyeball and sanity-check.</w:t>
+        <w:t>The task called for 5-10 real, publicly available documents, so 8 articles were pulled from Wikipedia (public content, CC BY-SA licensed) and saved as plain .txt files in docs/. Rather than picking random topics, they were deliberately grouped into related pairs -- two AI/ML articles, one AI-adjacent article, two about space, two about team sports, and one on climate. The reasoning: if the model works, related topics should score noticeably higher than unrelated ones, which makes the results easy to sanity-check.</w:t>
       </w:r>
     </w:p>
     <w:tbl>
@@ -339,7 +339,7 @@
     <w:p/>
     <w:p>
       <w:r>
-        <w:t>To keep the text clean (no HTML, no nav bars, no infobox clutter) I pulled each article through Wikipedia's REST API using action=query&amp;prop=extracts&amp;explaintext=1 instead of scraping the rendered page. Each file ended up around 1.2 KB, with a short Title: / Source: header on top so the origin is traceable.</w:t>
+        <w:t>To keep the text clean (no HTML, no nav bars, no infobox clutter), each article was pulled through Wikipedia's REST API using action=query&amp;prop=extracts&amp;explaintext=1 instead of scraping the rendered page. Each file ended up around 1.2 KB, with a short Title: / Source: header on top so the origin stays traceable.</w:t>
       </w:r>
     </w:p>
     <w:p>
@@ -393,7 +393,7 @@
     </w:p>
     <w:p>
       <w:r>
-        <w:t>I built the whole pipeline from scratch in vsm.py -- no scikit-learn, no pre-built TF-IDF vectorizer. numpy only shows up for the actual vector math (dot products, norms), not for any part of the algorithm itself. Here's roughly how it works, in the order the code runs it:</w:t>
+        <w:t>The pipeline was built from scratch in vsm.py -- no scikit-learn, no pre-built TF-IDF vectorizer. numpy is used only for the actual vector math (dot products, norms), not for any part of the algorithm itself. Here's roughly how it works, in the order the code runs it:</w:t>
       </w:r>
     </w:p>
     <w:p>
@@ -401,7 +401,7 @@
         <w:pStyle w:val="ListNumber"/>
       </w:pPr>
       <w:r>
-        <w:t>Tokenize &amp; normalize. Lowercase everything, pull out alphabetic tokens with a simple regex ([a-z]+), strip a small stopword list, and drop anything 2 characters or shorter. Nothing fancy -- no stemming or lemmatization, just enough cleanup to stop noise words from swamping the vectors.</w:t>
+        <w:t>Tokenize &amp; normalize. Lowercase everything, pull out alphabetic tokens with a simple regex ([a-z]+), strip a small stopword list, and drop anything 2 characters or shorter. No stemming or lemmatization -- just enough cleanup to stop noise words from swamping the vectors.</w:t>
       </w:r>
     </w:p>
     <w:p>
@@ -417,7 +417,7 @@
         <w:pStyle w:val="ListNumber"/>
       </w:pPr>
       <w:r>
-        <w:t>Term Frequency (TF). tf(t, d) = count(t in d) / len(d) -- how often a term shows up in a document, normalized by document length so longer documents don't automatically get bigger scores.</w:t>
+        <w:t>Term Frequency (TF). tf(t, d) = count(t in d) / len(d) -- how often a term shows up in a document, normalized by document length so longer documents don't automatically score higher.</w:t>
       </w:r>
     </w:p>
     <w:p>
@@ -425,7 +425,7 @@
         <w:pStyle w:val="ListNumber"/>
       </w:pPr>
       <w:r>
-        <w:t>Inverse Document Frequency (IDF). idf(t) = log(N / df(t)), where N is the total number of documents and df(t) is how many of them contain term t. This is really the important part -- it pushes down words that show up everywhere (things like "system" or "data") and gives more weight to words distinctive to just a few documents (like "neural", "mars", or "goalkeeper").</w:t>
+        <w:t>Inverse Document Frequency (IDF). idf(t) = log(N / df(t)), where N is the total number of documents and df(t) is how many of them contain term t. This is the important part -- it pushes down words that show up everywhere (things like "system" or "data") and gives more weight to words distinctive to just a few documents (like "neural", "mars", or "goalkeeper").</w:t>
       </w:r>
     </w:p>
     <w:p>
@@ -441,7 +441,7 @@
         <w:pStyle w:val="ListNumber"/>
       </w:pPr>
       <w:r>
-        <w:t>Cosine similarity. similarity(A, B) = (A · B) / (‖A‖ * ‖B‖). This is just the cosine of the angle between the vectors. It doesn't care how long the documents are (already handled by the TF normalization above), and since none of the TF-IDF weights are negative, the score always lands somewhere in [0, 1].</w:t>
+        <w:t>Cosine similarity. similarity(A, B) = (A · B) / (‖A‖ * ‖B‖). This is the cosine of the angle between the vectors. It doesn't care how long the documents are (already handled by the TF normalization above), and since none of the TF-IDF weights are negative, the score always lands somewhere in [0, 1].</w:t>
       </w:r>
     </w:p>
     <w:p>
@@ -488,7 +488,7 @@
     </w:p>
     <w:p>
       <w:r>
-        <w:t>Full implementation is in vsm.py (see GitHub repository) if you want to see the rest -- document loading, the driving loop that builds the pairwise matrix, etc.</w:t>
+        <w:t>Full implementation is in vsm.py (see GitHub repository), including document loading and the driving loop that builds the pairwise matrix.</w:t>
       </w:r>
     </w:p>
     <w:p>
@@ -1392,7 +1392,7 @@
     <w:p/>
     <w:p>
       <w:r>
-        <w:t>I also plotted it as a heatmap, which honestly makes the pattern a lot easier to spot than staring at the numbers:</w:t>
+        <w:t>Plotted as a heatmap, the pattern is a lot easier to spot than in the raw numbers:</w:t>
       </w:r>
     </w:p>
     <w:p>
@@ -1697,7 +1697,7 @@
     </w:p>
     <w:p>
       <w:r>
-        <w:t>What I like about these results is that they line up with what you'd expect just from reading the topics, which is a decent sign the model is actually capturing something real and not just noise:</w:t>
+        <w:t>The results line up with what the topic groupings would suggest, which is a good sign the model is capturing something real and not just noise:</w:t>
       </w:r>
     </w:p>
     <w:p>
@@ -1721,7 +1721,7 @@
         <w:pStyle w:val="ListBullet"/>
       </w:pPr>
       <w:r>
-        <w:t>Every pair that crosses topic clusters -- sports vs. climate, space vs. sports, whatever -- scores close to zero. That's the model correctly telling us there's no real topical connection there.</w:t>
+        <w:t>Every pair that crosses topic clusters -- sports vs. climate, space vs. sports, and so on -- scores close to zero. That correctly reflects no real topical connection between them.</w:t>
       </w:r>
     </w:p>
     <w:p>
@@ -1729,12 +1729,12 @@
         <w:pStyle w:val="ListBullet"/>
       </w:pPr>
       <w:r>
-        <w:t>One thing I found interesting: Large Language Model correlates more with AI (0.067) than with Machine Learning (0.059), even though you'd think ML and LLMs would be closer. My guess is the AI article uses more of the same framing language ("intelligence", "reasoning", "perception") that also shows up when LLMs get described.</w:t>
+        <w:t>One notable result: Large Language Model correlates more with AI (0.067) than with Machine Learning (0.059), even though ML and LLMs might be expected to be closer. A likely explanation is that the AI article uses more of the same framing language ("intelligence", "reasoning", "perception") that also shows up when LLMs are described.</w:t>
       </w:r>
     </w:p>
     <w:p>
       <w:r>
-        <w:t>The IDF term is really doing most of the heavy lifting here. Without it, common scaffolding words that appear in basically every article would dominate the vectors and every pair would score close to 1.0, regardless of topic. IDF suppresses those and lets the words that are actually distinctive to each topic drive the cosine score.</w:t>
+        <w:t>The IDF term is doing most of the heavy lifting here. Without it, common scaffolding words that appear in basically every article would dominate the vectors and every pair would score close to 1.0, regardless of topic. IDF suppresses those and lets the words actually distinctive to each topic drive the cosine score.</w:t>
       </w:r>
     </w:p>
     <w:p>

</xml_diff>

<commit_message>
Restructure report as a formal assignment submission
Introduction/Corpus/Methodology/Results/Analysis/Conclusion sections, figure/table numbering, replacing the tutorial-style walkthrough.

Co-Authored-By: Claude Sonnet 5 <noreply@anthropic.com>
</commit_message>
<xml_diff>
--- a/REPORT.docx
+++ b/REPORT.docx
@@ -7,7 +7,28 @@
         <w:pStyle w:val="Title"/>
       </w:pPr>
       <w:r>
-        <w:t>Document Similarity via Vector Space Model</w:t>
+        <w:t>Document Similarity Using a Vector Space Model</w:t>
+      </w:r>
+    </w:p>
+    <w:p>
+      <w:r>
+        <w:rPr>
+          <w:b/>
+        </w:rPr>
+        <w:t xml:space="preserve">Course: </w:t>
+      </w:r>
+      <w:r>
+        <w:t>Information Retrieval / Text Analytics</w:t>
+        <w:br/>
+      </w:r>
+      <w:r>
+        <w:rPr>
+          <w:b/>
+        </w:rPr>
+        <w:t xml:space="preserve">Assignment: </w:t>
+      </w:r>
+      <w:r>
+        <w:t>Document Similarity Scoring with a Vector Space Model</w:t>
       </w:r>
     </w:p>
     <w:p>
@@ -15,12 +36,12 @@
         <w:pStyle w:val="Heading1"/>
       </w:pPr>
       <w:r>
-        <w:t>1. Objective</w:t>
+        <w:t>1. Introduction</w:t>
       </w:r>
     </w:p>
     <w:p>
       <w:r>
-        <w:t>This assignment looks at how well a classic information retrieval technique -- the Vector Space Model (VSM) -- picks up on topical relationships between documents based purely on word usage, with no machine learning training involved. The approach combines TF-IDF term weighting with cosine similarity, computed between every pair of documents in a small collection.</w:t>
+        <w:t>Measuring similarity between text documents is a core problem in information retrieval, used in applications such as search ranking, plagiarism detection, and document clustering. This assignment implements the Vector Space Model (VSM), one of the foundational approaches to this problem, and applies it to a small corpus of publicly available documents. Each document is represented as a weighted term vector using TF-IDF, and similarity between document pairs is computed using cosine similarity.</w:t>
       </w:r>
     </w:p>
     <w:p>
@@ -28,12 +49,17 @@
         <w:pStyle w:val="Heading1"/>
       </w:pPr>
       <w:r>
-        <w:t>2. Document Collection</w:t>
+        <w:t>2. Corpus</w:t>
       </w:r>
     </w:p>
     <w:p>
       <w:r>
-        <w:t>The task called for 5-10 real, publicly available documents, so 8 articles were pulled from Wikipedia (public content, CC BY-SA licensed) and saved as plain .txt files in docs/. Rather than picking random topics, they were deliberately grouped into related pairs -- two AI/ML articles, one AI-adjacent article, two about space, two about team sports, and one on climate. The reasoning: if the model works, related topics should score noticeably higher than unrelated ones, which makes the results easy to sanity-check.</w:t>
+        <w:t>A total of 8 documents were collected for this assignment, satisfying the requirement of 5-10 publicly accessible documents. The corpus was drawn from Wikipedia, a freely accessible and citable source (content licensed under CC BY-SA), and saved as plain .txt files in the docs/ directory.</w:t>
+      </w:r>
+    </w:p>
+    <w:p>
+      <w:r>
+        <w:t>The topics were selected in related pairs so that the correctness of the similarity results could be verified against expectation: two articles on AI/ML, one AI-adjacent article, two on space exploration, two on team sports, and one on climate. If the model performs correctly, documents within the same topic pair should receive noticeably higher similarity scores than documents from unrelated pairs.</w:t>
       </w:r>
     </w:p>
     <w:tbl>
@@ -339,12 +365,12 @@
     <w:p/>
     <w:p>
       <w:r>
-        <w:t>To keep the text clean (no HTML, no nav bars, no infobox clutter), each article was pulled through Wikipedia's REST API using action=query&amp;prop=extracts&amp;explaintext=1 instead of scraping the rendered page. Each file ended up around 1.2 KB, with a short Title: / Source: header on top so the origin stays traceable.</w:t>
+        <w:t>Documents were retrieved using Wikipedia's REST API (action=query&amp;prop=extracts&amp;explaintext=1), which returns clean plain text without HTML markup, navigation elements, or infobox content. Each file is approximately 1.2 KB and includes a Title: / Source: header identifying its origin.</w:t>
       </w:r>
     </w:p>
     <w:p>
       <w:r>
-        <w:t>Snapshot — document collection loaded:</w:t>
+        <w:t>Figure 1 — Document collection loaded by the program:</w:t>
       </w:r>
     </w:p>
     <w:p>
@@ -388,12 +414,12 @@
         <w:pStyle w:val="Heading1"/>
       </w:pPr>
       <w:r>
-        <w:t>3. Method: Vector Space Model</w:t>
+        <w:t>3. Methodology</w:t>
       </w:r>
     </w:p>
     <w:p>
       <w:r>
-        <w:t>The pipeline was built from scratch in vsm.py -- no scikit-learn, no pre-built TF-IDF vectorizer. numpy is used only for the actual vector math (dot products, norms), not for any part of the algorithm itself. Here's roughly how it works, in the order the code runs it:</w:t>
+        <w:t>The VSM pipeline was implemented from first principles in vsm.py, without relying on pre-built vectorizers such as scikit-learn's TfidfVectorizer. numpy is used only for vector arithmetic (dot products and norms), not for any part of the weighting algorithm. The pipeline consists of the following stages:</w:t>
       </w:r>
     </w:p>
     <w:p>
@@ -401,7 +427,7 @@
         <w:pStyle w:val="ListNumber"/>
       </w:pPr>
       <w:r>
-        <w:t>Tokenize &amp; normalize. Lowercase everything, pull out alphabetic tokens with a simple regex ([a-z]+), strip a small stopword list, and drop anything 2 characters or shorter. No stemming or lemmatization -- just enough cleanup to stop noise words from swamping the vectors.</w:t>
+        <w:t>Tokenization and normalization. Text is lowercased and split into alphabetic tokens using the regular expression [a-z]+. A stopword list is applied to remove common function words, and tokens of length 2 or fewer are discarded. No stemming or lemmatization is applied.</w:t>
       </w:r>
     </w:p>
     <w:p>
@@ -409,7 +435,7 @@
         <w:pStyle w:val="ListNumber"/>
       </w:pPr>
       <w:r>
-        <w:t>Build the vocabulary. Union of every term across all 8 documents. For this collection that came out to 601 unique terms.</w:t>
+        <w:t>Vocabulary construction. The vocabulary is the union of all terms across the corpus. For this dataset, the vocabulary contains 601 unique terms.</w:t>
       </w:r>
     </w:p>
     <w:p>
@@ -417,7 +443,7 @@
         <w:pStyle w:val="ListNumber"/>
       </w:pPr>
       <w:r>
-        <w:t>Term Frequency (TF). tf(t, d) = count(t in d) / len(d) -- how often a term shows up in a document, normalized by document length so longer documents don't automatically score higher.</w:t>
+        <w:t>Term Frequency (TF). For a term t and document d: tf(t, d) = count(t in d) / len(d). Raw term counts are normalized by document length so that longer documents do not receive inflated scores.</w:t>
       </w:r>
     </w:p>
     <w:p>
@@ -425,7 +451,7 @@
         <w:pStyle w:val="ListNumber"/>
       </w:pPr>
       <w:r>
-        <w:t>Inverse Document Frequency (IDF). idf(t) = log(N / df(t)), where N is the total number of documents and df(t) is how many of them contain term t. This is the important part -- it pushes down words that show up everywhere (things like "system" or "data") and gives more weight to words distinctive to just a few documents (like "neural", "mars", or "goalkeeper").</w:t>
+        <w:t>Inverse Document Frequency (IDF). For a term t: idf(t) = log(N / df(t)), where N is the total number of documents and df(t) is the number of documents containing t. IDF down-weights terms that occur across most or all documents (e.g. "system", "data") and up-weights terms that are distinctive to a small subset of documents (e.g. "neural", "mars", "goalkeeper").</w:t>
       </w:r>
     </w:p>
     <w:p>
@@ -433,7 +459,7 @@
         <w:pStyle w:val="ListNumber"/>
       </w:pPr>
       <w:r>
-        <w:t>TF-IDF vector. Multiply the two together -- tfidf(t, d) = tf(t, d) * idf(t) -- and each document ends up represented as a point in a 601-dimensional space, one axis per vocabulary term.</w:t>
+        <w:t>TF-IDF weighting. The final weight for each term in each document is tfidf(t, d) = tf(t, d) * idf(t). Each document is thus represented as a vector in a 601-dimensional space, with one dimension per vocabulary term.</w:t>
       </w:r>
     </w:p>
     <w:p>
@@ -441,12 +467,15 @@
         <w:pStyle w:val="ListNumber"/>
       </w:pPr>
       <w:r>
-        <w:t>Cosine similarity. similarity(A, B) = (A · B) / (‖A‖ * ‖B‖). This is the cosine of the angle between the vectors. It doesn't care how long the documents are (already handled by the TF normalization above), and since none of the TF-IDF weights are negative, the score always lands somewhere in [0, 1].</w:t>
+        <w:t>Cosine similarity. For two document vectors A and B: similarity(A, B) = (A · B) / (‖A‖ * ‖B‖). Cosine similarity measures the angle between two vectors rather than their magnitude, making it independent of document length. As all TF-IDF weights are non-negative, the resulting score is bounded in the range [0, 1].</w:t>
       </w:r>
     </w:p>
     <w:p>
+      <w:pPr>
+        <w:pStyle w:val="Heading2"/>
+      </w:pPr>
       <w:r>
-        <w:t>Core code:</w:t>
+        <w:t>3.1 Implementation</w:t>
       </w:r>
     </w:p>
     <w:p>
@@ -488,7 +517,7 @@
     </w:p>
     <w:p>
       <w:r>
-        <w:t>Full implementation is in vsm.py (see GitHub repository), including document loading and the driving loop that builds the pairwise matrix.</w:t>
+        <w:t>The complete implementation, including document loading and the pairwise similarity computation, is provided in vsm.py (see GitHub repository).</w:t>
       </w:r>
     </w:p>
     <w:p>
@@ -501,7 +530,7 @@
     </w:p>
     <w:p>
       <w:r>
-        <w:t>Snapshot — cosine similarity matrix (terminal output):</w:t>
+        <w:t>Figure 2 — Program output: cosine similarity matrix</w:t>
       </w:r>
     </w:p>
     <w:p>
@@ -542,7 +571,7 @@
     </w:p>
     <w:p>
       <w:r>
-        <w:t>Full matrix, for reference:</w:t>
+        <w:t>Table 1 — Full pairwise cosine similarity matrix</w:t>
       </w:r>
     </w:p>
     <w:tbl>
@@ -1392,7 +1421,7 @@
     <w:p/>
     <w:p>
       <w:r>
-        <w:t>Plotted as a heatmap, the pattern is a lot easier to spot than in the raw numbers:</w:t>
+        <w:t>Figure 3 — Similarity matrix as a heatmap</w:t>
       </w:r>
     </w:p>
     <w:p>
@@ -1434,7 +1463,7 @@
     <w:p/>
     <w:p>
       <w:r>
-        <w:t>And the top/bottom pairs, pulled straight from the script's own output:</w:t>
+        <w:t>Figure 4 — Most and least similar document pairs</w:t>
       </w:r>
     </w:p>
     <w:p>
@@ -1474,11 +1503,8 @@
       </w:r>
     </w:p>
     <w:p>
-      <w:pPr>
-        <w:pStyle w:val="Heading2"/>
-      </w:pPr>
       <w:r>
-        <w:t>Top 3 most similar pairs</w:t>
+        <w:t>Table 2 — Top 3 most similar pairs</w:t>
       </w:r>
     </w:p>
     <w:tbl>
@@ -1580,12 +1606,10 @@
         </w:tc>
       </w:tr>
     </w:tbl>
+    <w:p/>
     <w:p>
-      <w:pPr>
-        <w:pStyle w:val="Heading2"/>
-      </w:pPr>
       <w:r>
-        <w:t>Bottom 3 least similar pairs</w:t>
+        <w:t>Table 3 — Bottom 3 least similar pairs</w:t>
       </w:r>
     </w:p>
     <w:tbl>
@@ -1692,49 +1716,37 @@
         <w:pStyle w:val="Heading1"/>
       </w:pPr>
       <w:r>
-        <w:t>5. Discussion</w:t>
+        <w:t>5. Analysis</w:t>
       </w:r>
     </w:p>
     <w:p>
       <w:r>
-        <w:t>The results line up with what the topic groupings would suggest, which is a good sign the model is capturing something real and not just noise:</w:t>
-      </w:r>
-    </w:p>
-    <w:p>
-      <w:pPr>
-        <w:pStyle w:val="ListBullet"/>
-      </w:pPr>
-      <w:r>
-        <w:t>AI ↔ Machine Learning came out on top at 0.207, which makes sense -- ML is basically a subfield of AI, so the two articles share a lot of vocabulary (learning, model, neural, data all show up in both).</w:t>
-      </w:r>
-    </w:p>
-    <w:p>
-      <w:pPr>
-        <w:pStyle w:val="ListBullet"/>
-      </w:pPr>
-      <w:r>
-        <w:t>Football ↔ Basketball was second at 0.127. Both are team-sport articles, so words like team, player, game, and league overlap heavily.</w:t>
-      </w:r>
-    </w:p>
-    <w:p>
-      <w:pPr>
-        <w:pStyle w:val="ListBullet"/>
-      </w:pPr>
-      <w:r>
-        <w:t>Every pair that crosses topic clusters -- sports vs. climate, space vs. sports, and so on -- scores close to zero. That correctly reflects no real topical connection between them.</w:t>
-      </w:r>
-    </w:p>
-    <w:p>
-      <w:pPr>
-        <w:pStyle w:val="ListBullet"/>
-      </w:pPr>
-      <w:r>
-        <w:t>One notable result: Large Language Model correlates more with AI (0.067) than with Machine Learning (0.059), even though ML and LLMs might be expected to be closer. A likely explanation is that the AI article uses more of the same framing language ("intelligence", "reasoning", "perception") that also shows up when LLMs are described.</w:t>
+        <w:t>The results are consistent with the topic groupings defined in Section 2, indicating that the model correctly captures topical similarity from term distributions alone.</w:t>
       </w:r>
     </w:p>
     <w:p>
       <w:r>
-        <w:t>The IDF term is doing most of the heavy lifting here. Without it, common scaffolding words that appear in basically every article would dominate the vectors and every pair would score close to 1.0, regardless of topic. IDF suppresses those and lets the words actually distinctive to each topic drive the cosine score.</w:t>
+        <w:t>The highest similarity score (0.207) was observed between the Artificial Intelligence and Machine Learning documents. This is expected, as Machine Learning is a subfield of Artificial Intelligence and both articles share substantial vocabulary, including terms such as "learning," "model," "neural," and "data."</w:t>
+      </w:r>
+    </w:p>
+    <w:p>
+      <w:r>
+        <w:t>The second-highest score (0.127) was observed between the Association Football and Basketball documents. Both are team-sport articles that share terms such as "team," "player," "game," and "league."</w:t>
+      </w:r>
+    </w:p>
+    <w:p>
+      <w:r>
+        <w:t>All document pairs spanning unrelated topic clusters (for example, sports versus climate, or space versus sports) scored close to zero, correctly indicating no meaningful topical overlap.</w:t>
+      </w:r>
+    </w:p>
+    <w:p>
+      <w:r>
+        <w:t>One notable result is that the Large Language Model document correlates more strongly with the Artificial Intelligence document (0.067) than with the Machine Learning document (0.059), despite the technical proximity between LLMs and machine learning. A plausible explanation is that the Artificial Intelligence article uses framing vocabulary (e.g. "intelligence," "reasoning," "perception") that is also present in discussions of large language models.</w:t>
+      </w:r>
+    </w:p>
+    <w:p>
+      <w:r>
+        <w:t>The IDF component of the weighting scheme is primarily responsible for these results. Without IDF, high-frequency scaffolding words common to nearly every document would dominate the term vectors, and all document pairs would score close to 1.0 regardless of topic. IDF suppresses these ubiquitous terms, allowing the vocabulary distinctive to each topic to drive the cosine similarity score.</w:t>
       </w:r>
     </w:p>
     <w:p>
@@ -1742,7 +1754,20 @@
         <w:pStyle w:val="Heading1"/>
       </w:pPr>
       <w:r>
-        <w:t>6. How to Reproduce</w:t>
+        <w:t>6. Conclusion</w:t>
+      </w:r>
+    </w:p>
+    <w:p>
+      <w:r>
+        <w:t>This assignment demonstrated a complete Vector Space Model pipeline -- tokenization, TF-IDF weighting, and cosine similarity -- applied to an 8-document corpus gathered from publicly available sources. The resulting similarity scores correctly identified topically related document pairs (AI/Machine Learning, Football/Basketball) and assigned near-zero scores to unrelated pairs, confirming that the model is functioning as intended. The results also illustrate the importance of IDF weighting in distinguishing topic-specific vocabulary from common language patterns shared across all documents.</w:t>
+      </w:r>
+    </w:p>
+    <w:p>
+      <w:pPr>
+        <w:pStyle w:val="Heading1"/>
+      </w:pPr>
+      <w:r>
+        <w:t>7. How to Reproduce</w:t>
       </w:r>
     </w:p>
     <w:p>
@@ -1765,7 +1790,7 @@
         <w:pStyle w:val="Heading1"/>
       </w:pPr>
       <w:r>
-        <w:t>7. GitHub Repository</w:t>
+        <w:t>8. GitHub Repository</w:t>
       </w:r>
     </w:p>
     <w:p>

</xml_diff>

<commit_message>
Add References section and GitHub repo link to report
Co-Authored-By: Claude Sonnet 5 <noreply@anthropic.com>
</commit_message>
<xml_diff>
--- a/REPORT.docx
+++ b/REPORT.docx
@@ -1767,7 +1767,20 @@
         <w:pStyle w:val="Heading1"/>
       </w:pPr>
       <w:r>
-        <w:t>7. How to Reproduce</w:t>
+        <w:t>7. GitHub Repository</w:t>
+      </w:r>
+    </w:p>
+    <w:p>
+      <w:r>
+        <w:t>Full source code, documents, and this report are published at: https://github.com/Chief-spartan-117/TECH-400/tree/vsm-document-similarity</w:t>
+      </w:r>
+    </w:p>
+    <w:p>
+      <w:pPr>
+        <w:pStyle w:val="Heading1"/>
+      </w:pPr>
+      <w:r>
+        <w:t>8. How to Reproduce</w:t>
       </w:r>
     </w:p>
     <w:p>
@@ -1790,12 +1803,108 @@
         <w:pStyle w:val="Heading1"/>
       </w:pPr>
       <w:r>
-        <w:t>8. GitHub Repository</w:t>
+        <w:t>9. References</w:t>
+      </w:r>
+    </w:p>
+    <w:p>
+      <w:pPr>
+        <w:pStyle w:val="ListNumber"/>
+      </w:pPr>
+      <w:r>
+        <w:t>Salton, G., Wong, A., &amp; Yang, C. S. (1975). A vector space model for automatic indexing. Communications of the ACM, 18(11), 613-620.</w:t>
+      </w:r>
+    </w:p>
+    <w:p>
+      <w:pPr>
+        <w:pStyle w:val="ListNumber"/>
+      </w:pPr>
+      <w:r>
+        <w:t>Manning, C. D., Raghavan, P., &amp; Schutze, H. (2008). Introduction to Information Retrieval. Cambridge University Press. (Chapters 6-7: term weighting, TF-IDF, and the vector space model.)</w:t>
+      </w:r>
+    </w:p>
+    <w:p>
+      <w:pPr>
+        <w:pStyle w:val="ListNumber"/>
+      </w:pPr>
+      <w:r>
+        <w:t>Wikipedia contributors. "Artificial intelligence." Wikipedia, The Free Encyclopedia. https://en.wikipedia.org/wiki/Artificial_intelligence</w:t>
+      </w:r>
+    </w:p>
+    <w:p>
+      <w:pPr>
+        <w:pStyle w:val="ListNumber"/>
+      </w:pPr>
+      <w:r>
+        <w:t>Wikipedia contributors. "Machine learning." Wikipedia, The Free Encyclopedia. https://en.wikipedia.org/wiki/Machine_learning</w:t>
+      </w:r>
+    </w:p>
+    <w:p>
+      <w:pPr>
+        <w:pStyle w:val="ListNumber"/>
+      </w:pPr>
+      <w:r>
+        <w:t>Wikipedia contributors. "Large language model." Wikipedia, The Free Encyclopedia. https://en.wikipedia.org/wiki/Large_language_model</w:t>
+      </w:r>
+    </w:p>
+    <w:p>
+      <w:pPr>
+        <w:pStyle w:val="ListNumber"/>
+      </w:pPr>
+      <w:r>
+        <w:t>Wikipedia contributors. "NASA." Wikipedia, The Free Encyclopedia. https://en.wikipedia.org/wiki/NASA</w:t>
+      </w:r>
+    </w:p>
+    <w:p>
+      <w:pPr>
+        <w:pStyle w:val="ListNumber"/>
+      </w:pPr>
+      <w:r>
+        <w:t>Wikipedia contributors. "Mars." Wikipedia, The Free Encyclopedia. https://en.wikipedia.org/wiki/Mars</w:t>
+      </w:r>
+    </w:p>
+    <w:p>
+      <w:pPr>
+        <w:pStyle w:val="ListNumber"/>
+      </w:pPr>
+      <w:r>
+        <w:t>Wikipedia contributors. "Association football." Wikipedia, The Free Encyclopedia. https://en.wikipedia.org/wiki/Association_football</w:t>
+      </w:r>
+    </w:p>
+    <w:p>
+      <w:pPr>
+        <w:pStyle w:val="ListNumber"/>
+      </w:pPr>
+      <w:r>
+        <w:t>Wikipedia contributors. "Basketball." Wikipedia, The Free Encyclopedia. https://en.wikipedia.org/wiki/Basketball</w:t>
+      </w:r>
+    </w:p>
+    <w:p>
+      <w:pPr>
+        <w:pStyle w:val="ListNumber"/>
+      </w:pPr>
+      <w:r>
+        <w:t>Wikipedia contributors. "Climate change." Wikipedia, The Free Encyclopedia. https://en.wikipedia.org/wiki/Climate_change</w:t>
+      </w:r>
+    </w:p>
+    <w:p>
+      <w:pPr>
+        <w:pStyle w:val="ListNumber"/>
+      </w:pPr>
+      <w:r>
+        <w:t>Wikimedia Foundation. MediaWiki Action API -- prop=extracts. https://www.mediawiki.org/wiki/API:Query#Additional_notes (used to retrieve plain-text article extracts, Section 2).</w:t>
+      </w:r>
+    </w:p>
+    <w:p>
+      <w:pPr>
+        <w:pStyle w:val="ListNumber"/>
+      </w:pPr>
+      <w:r>
+        <w:t>Harris, C.R. et al. (2020). Array programming with NumPy. Nature, 585, 357-362. https://numpy.org (used for vector arithmetic in vsm.py).</w:t>
       </w:r>
     </w:p>
     <w:p>
       <w:r>
-        <w:t>Full source code, documents, and this report are published at: [GitHub link — see submission]</w:t>
+        <w:t>All Wikipedia content is licensed under Creative Commons Attribution-ShareAlike 4.0 (CC BY-SA 4.0).</w:t>
       </w:r>
     </w:p>
     <w:sectPr>

</xml_diff>